<commit_message>
chore: renombra la app a AuraSacrapp
Cambia el nombre en la app Android (paquete cl.duoc.aurasacrapp, applicationId,
tema y base Room), el backend (paquete y artifactId), la base MySQL
(aura_sacrapp), los correos de prueba, el contenido de los QR
(aurasacrapp:recinto:N), el README y los documentos.

Co-Authored-By: Claude Opus 5.5 <noreply@anthropic.com>
</commit_message>
<xml_diff>
--- a/docs/historias de usuario proyecto aplicaciones moviles.docx
+++ b/docs/historias de usuario proyecto aplicaciones moviles.docx
@@ -31,7 +31,7 @@
           <w:sz w:val="24"/>
           <w:szCs w:val="24"/>
         </w:rPr>
-        <w:t xml:space="preserve">App móvil Santiago Sacro · Caso Red Patrimonial de Santiago (Arzobispado de Santiago)</w:t>
+        <w:t xml:space="preserve">App móvil AuraSacrapp · Caso Red Patrimonial de Santiago (Arzobispado de Santiago)</w:t>
       </w:r>
     </w:p>
     <w:p>
@@ -22413,7 +22413,7 @@
         <w:sz w:val="18"/>
         <w:szCs w:val="18"/>
       </w:rPr>
-      <w:t xml:space="preserve">Historias de usuario · App Santiago Sacro · página </w:t>
+      <w:t xml:space="preserve">Historias de usuario · App AuraSacrapp · página </w:t>
     </w:r>
     <w:r>
       <w:rPr>

</xml_diff>